<commit_message>
docs: remove .pub-file-wrong-app section from CI/CD setup doc
Minor setup hiccup, not worth keeping in the record.

Co-Authored-By: Claude Sonnet 5 <noreply@anthropic.com>
</commit_message>
<xml_diff>
--- a/ci-cd-setup/CI-CD-Setup-dm-dashboard.docx
+++ b/ci-cd-setup/CI-CD-Setup-dm-dashboard.docx
@@ -159,14 +159,14 @@
         <w:pStyle w:val="Heading2"/>
       </w:pPr>
       <w:r>
-        <w:t xml:space="preserve">Step 1b — .pub file opened with the wrong app</w:t>
+        <w:t xml:space="preserve">Step 2 — Public key added to the VPS</w:t>
       </w:r>
     </w:p>
     <w:p>
       <w:r>
         <w:drawing>
           <wp:inline distT="0" distB="0" distL="0" distR="0">
-            <wp:extent cx="5715000" cy="2838450"/>
+            <wp:extent cx="5715000" cy="1000125"/>
             <wp:effectExtent t="0" r="0" b="0" l="0"/>
             <wp:docPr id="1" name="" descr="" title=""/>
             <wp:cNvGraphicFramePr>
@@ -191,7 +191,7 @@
                   <pic:spPr bwMode="auto">
                     <a:xfrm>
                       <a:off x="0" y="0"/>
-                      <a:ext cx="5715000" cy="2838450"/>
+                      <a:ext cx="5715000" cy="1000125"/>
                     </a:xfrm>
                     <a:prstGeom prst="rect">
                       <a:avLst/>
@@ -213,7 +213,7 @@
           <w:sz w:val="20"/>
           <w:szCs w:val="20"/>
         </w:rPr>
-        <w:t xml:space="preserve">Windows had no default app for an extensionless/.pub file and tried Microsoft Publisher. Opened with Notepad instead to read the key.</w:t>
+        <w:t xml:space="preserve">Connected to the Contabo VPS and appended the new public key to ~/.ssh/authorized_keys, then confirmed with cat — the new "github-actions-deploy" key is listed.</w:t>
       </w:r>
     </w:p>
     <w:p/>
@@ -222,14 +222,14 @@
         <w:pStyle w:val="Heading2"/>
       </w:pPr>
       <w:r>
-        <w:t xml:space="preserve">Step 2 — Public key added to the VPS</w:t>
+        <w:t xml:space="preserve">Step 3 (navigation) — GitHub Actions "get started" page</w:t>
       </w:r>
     </w:p>
     <w:p>
       <w:r>
         <w:drawing>
           <wp:inline distT="0" distB="0" distL="0" distR="0">
-            <wp:extent cx="5715000" cy="1000125"/>
+            <wp:extent cx="5715000" cy="3009900"/>
             <wp:effectExtent t="0" r="0" b="0" l="0"/>
             <wp:docPr id="1" name="" descr="" title=""/>
             <wp:cNvGraphicFramePr>
@@ -254,7 +254,7 @@
                   <pic:spPr bwMode="auto">
                     <a:xfrm>
                       <a:off x="0" y="0"/>
-                      <a:ext cx="5715000" cy="1000125"/>
+                      <a:ext cx="5715000" cy="3009900"/>
                     </a:xfrm>
                     <a:prstGeom prst="rect">
                       <a:avLst/>
@@ -276,7 +276,7 @@
           <w:sz w:val="20"/>
           <w:szCs w:val="20"/>
         </w:rPr>
-        <w:t xml:space="preserve">Connected to the Contabo VPS and appended the new public key to ~/.ssh/authorized_keys, then confirmed with cat — the new "github-actions-deploy" key is listed.</w:t>
+        <w:t xml:space="preserve">The default Actions landing page reached before going to Settings first for the secrets.</w:t>
       </w:r>
     </w:p>
     <w:p/>
@@ -285,14 +285,14 @@
         <w:pStyle w:val="Heading2"/>
       </w:pPr>
       <w:r>
-        <w:t xml:space="preserve">Step 3 (navigation) — GitHub Actions "get started" page</w:t>
+        <w:t xml:space="preserve">Step 3 — Repository secrets page (before)</w:t>
       </w:r>
     </w:p>
     <w:p>
       <w:r>
         <w:drawing>
           <wp:inline distT="0" distB="0" distL="0" distR="0">
-            <wp:extent cx="5715000" cy="3009900"/>
+            <wp:extent cx="5715000" cy="3038475"/>
             <wp:effectExtent t="0" r="0" b="0" l="0"/>
             <wp:docPr id="1" name="" descr="" title=""/>
             <wp:cNvGraphicFramePr>
@@ -317,7 +317,7 @@
                   <pic:spPr bwMode="auto">
                     <a:xfrm>
                       <a:off x="0" y="0"/>
-                      <a:ext cx="5715000" cy="3009900"/>
+                      <a:ext cx="5715000" cy="3038475"/>
                     </a:xfrm>
                     <a:prstGeom prst="rect">
                       <a:avLst/>
@@ -339,7 +339,7 @@
           <w:sz w:val="20"/>
           <w:szCs w:val="20"/>
         </w:rPr>
-        <w:t xml:space="preserve">The default Actions landing page reached before going to Settings first for the secrets.</w:t>
+        <w:t xml:space="preserve">Settings &gt; Secrets and variables &gt; Actions, before any of the 4 deploy secrets were added.</w:t>
       </w:r>
     </w:p>
     <w:p/>
@@ -348,14 +348,14 @@
         <w:pStyle w:val="Heading2"/>
       </w:pPr>
       <w:r>
-        <w:t xml:space="preserve">Step 3 — Repository secrets page (before)</w:t>
+        <w:t xml:space="preserve">Step 3 — All 4 secrets added</w:t>
       </w:r>
     </w:p>
     <w:p>
       <w:r>
         <w:drawing>
           <wp:inline distT="0" distB="0" distL="0" distR="0">
-            <wp:extent cx="5715000" cy="3038475"/>
+            <wp:extent cx="5715000" cy="2981325"/>
             <wp:effectExtent t="0" r="0" b="0" l="0"/>
             <wp:docPr id="1" name="" descr="" title=""/>
             <wp:cNvGraphicFramePr>
@@ -380,7 +380,7 @@
                   <pic:spPr bwMode="auto">
                     <a:xfrm>
                       <a:off x="0" y="0"/>
-                      <a:ext cx="5715000" cy="3038475"/>
+                      <a:ext cx="5715000" cy="2981325"/>
                     </a:xfrm>
                     <a:prstGeom prst="rect">
                       <a:avLst/>
@@ -402,7 +402,7 @@
           <w:sz w:val="20"/>
           <w:szCs w:val="20"/>
         </w:rPr>
-        <w:t xml:space="preserve">Settings &gt; Secrets and variables &gt; Actions, before any of the 4 deploy secrets were added.</w:t>
+        <w:t xml:space="preserve">VPS_HOST, VPS_SSH_KEY, VPS_SSH_PORT, and VPS_USER all confirmed present in the repository secrets list.</w:t>
       </w:r>
     </w:p>
     <w:p/>
@@ -411,7 +411,7 @@
         <w:pStyle w:val="Heading2"/>
       </w:pPr>
       <w:r>
-        <w:t xml:space="preserve">Step 3 — All 4 secrets added</w:t>
+        <w:t xml:space="preserve">Step 4 — Workflow YAML in the GitHub editor</w:t>
       </w:r>
     </w:p>
     <w:p>
@@ -465,7 +465,7 @@
           <w:sz w:val="20"/>
           <w:szCs w:val="20"/>
         </w:rPr>
-        <w:t xml:space="preserve">VPS_HOST, VPS_SSH_KEY, VPS_SSH_PORT, and VPS_USER all confirmed present in the repository secrets list.</w:t>
+        <w:t xml:space="preserve">deploy.yml created directly in GitHub's web editor under .github/workflows/, triggered on push to main, running the existing deploy.sh over SSH via the appleboy/ssh-action.</w:t>
       </w:r>
     </w:p>
     <w:p/>
@@ -474,7 +474,7 @@
         <w:pStyle w:val="Heading2"/>
       </w:pPr>
       <w:r>
-        <w:t xml:space="preserve">Step 4 — Workflow YAML in the GitHub editor</w:t>
+        <w:t xml:space="preserve">Step 4 — Committing the workflow file</w:t>
       </w:r>
     </w:p>
     <w:p>
@@ -528,7 +528,7 @@
           <w:sz w:val="20"/>
           <w:szCs w:val="20"/>
         </w:rPr>
-        <w:t xml:space="preserve">deploy.yml created directly in GitHub's web editor under .github/workflows/, triggered on push to main, running the existing deploy.sh over SSH via the appleboy/ssh-action.</w:t>
+        <w:t xml:space="preserve">Commit dialog, committing deploy.yml directly to the main branch.</w:t>
       </w:r>
     </w:p>
     <w:p/>
@@ -537,14 +537,14 @@
         <w:pStyle w:val="Heading2"/>
       </w:pPr>
       <w:r>
-        <w:t xml:space="preserve">Step 4 — Committing the workflow file</w:t>
+        <w:t xml:space="preserve">Step 4 — deploy.yml committed</w:t>
       </w:r>
     </w:p>
     <w:p>
       <w:r>
         <w:drawing>
           <wp:inline distT="0" distB="0" distL="0" distR="0">
-            <wp:extent cx="5715000" cy="2981325"/>
+            <wp:extent cx="5715000" cy="2857500"/>
             <wp:effectExtent t="0" r="0" b="0" l="0"/>
             <wp:docPr id="1" name="" descr="" title=""/>
             <wp:cNvGraphicFramePr>
@@ -569,7 +569,7 @@
                   <pic:spPr bwMode="auto">
                     <a:xfrm>
                       <a:off x="0" y="0"/>
-                      <a:ext cx="5715000" cy="2981325"/>
+                      <a:ext cx="5715000" cy="2857500"/>
                     </a:xfrm>
                     <a:prstGeom prst="rect">
                       <a:avLst/>
@@ -591,7 +591,7 @@
           <w:sz w:val="20"/>
           <w:szCs w:val="20"/>
         </w:rPr>
-        <w:t xml:space="preserve">Commit dialog, committing deploy.yml directly to the main branch.</w:t>
+        <w:t xml:space="preserve">The file now exists in .github/workflows/ on main.</w:t>
       </w:r>
     </w:p>
     <w:p/>
@@ -600,14 +600,14 @@
         <w:pStyle w:val="Heading2"/>
       </w:pPr>
       <w:r>
-        <w:t xml:space="preserve">Step 4 — deploy.yml committed</w:t>
+        <w:t xml:space="preserve">Step 5 — First automatic deploy run: SUCCESS</w:t>
       </w:r>
     </w:p>
     <w:p>
       <w:r>
         <w:drawing>
           <wp:inline distT="0" distB="0" distL="0" distR="0">
-            <wp:extent cx="5715000" cy="2857500"/>
+            <wp:extent cx="5715000" cy="3009900"/>
             <wp:effectExtent t="0" r="0" b="0" l="0"/>
             <wp:docPr id="1" name="" descr="" title=""/>
             <wp:cNvGraphicFramePr>
@@ -632,7 +632,7 @@
                   <pic:spPr bwMode="auto">
                     <a:xfrm>
                       <a:off x="0" y="0"/>
-                      <a:ext cx="5715000" cy="2857500"/>
+                      <a:ext cx="5715000" cy="3009900"/>
                     </a:xfrm>
                     <a:prstGeom prst="rect">
                       <a:avLst/>
@@ -654,7 +654,7 @@
           <w:sz w:val="20"/>
           <w:szCs w:val="20"/>
         </w:rPr>
-        <w:t xml:space="preserve">The file now exists in .github/workflows/ on main.</w:t>
+        <w:t xml:space="preserve">The commit that added the workflow was itself a push to main, so it immediately triggered the very first automated run — green check, completed in 19 seconds. CI/CD is live: every future merge to main now deploys automatically.</w:t>
       </w:r>
     </w:p>
     <w:p/>
@@ -663,14 +663,14 @@
         <w:pStyle w:val="Heading2"/>
       </w:pPr>
       <w:r>
-        <w:t xml:space="preserve">Step 5 — First automatic deploy run: SUCCESS</w:t>
+        <w:t xml:space="preserve">Step 5 (verification) — Confirmed on the VPS itself</w:t>
       </w:r>
     </w:p>
     <w:p>
       <w:r>
         <w:drawing>
           <wp:inline distT="0" distB="0" distL="0" distR="0">
-            <wp:extent cx="5715000" cy="3009900"/>
+            <wp:extent cx="5715000" cy="2314575"/>
             <wp:effectExtent t="0" r="0" b="0" l="0"/>
             <wp:docPr id="1" name="" descr="" title=""/>
             <wp:cNvGraphicFramePr>
@@ -695,69 +695,6 @@
                   <pic:spPr bwMode="auto">
                     <a:xfrm>
                       <a:off x="0" y="0"/>
-                      <a:ext cx="5715000" cy="3009900"/>
-                    </a:xfrm>
-                    <a:prstGeom prst="rect">
-                      <a:avLst/>
-                    </a:prstGeom>
-                  </pic:spPr>
-                </pic:pic>
-              </a:graphicData>
-            </a:graphic>
-          </wp:inline>
-        </w:drawing>
-      </w:r>
-    </w:p>
-    <w:p>
-      <w:r>
-        <w:rPr>
-          <w:i/>
-          <w:iCs/>
-          <w:color w:val="555555"/>
-          <w:sz w:val="20"/>
-          <w:szCs w:val="20"/>
-        </w:rPr>
-        <w:t xml:space="preserve">The commit that added the workflow was itself a push to main, so it immediately triggered the very first automated run — green check, completed in 19 seconds. CI/CD is live: every future merge to main now deploys automatically.</w:t>
-      </w:r>
-    </w:p>
-    <w:p/>
-    <w:p>
-      <w:pPr>
-        <w:pStyle w:val="Heading2"/>
-      </w:pPr>
-      <w:r>
-        <w:t xml:space="preserve">Step 5 (verification) — Confirmed on the VPS itself</w:t>
-      </w:r>
-    </w:p>
-    <w:p>
-      <w:r>
-        <w:drawing>
-          <wp:inline distT="0" distB="0" distL="0" distR="0">
-            <wp:extent cx="5715000" cy="2314575"/>
-            <wp:effectExtent t="0" r="0" b="0" l="0"/>
-            <wp:docPr id="1" name="" descr="" title=""/>
-            <wp:cNvGraphicFramePr>
-              <a:graphicFrameLocks xmlns:a="http://schemas.openxmlformats.org/drawingml/2006/main" noChangeAspect="1"/>
-            </wp:cNvGraphicFramePr>
-            <a:graphic xmlns:a="http://schemas.openxmlformats.org/drawingml/2006/main">
-              <a:graphicData uri="http://schemas.openxmlformats.org/drawingml/2006/picture">
-                <pic:pic xmlns:pic="http://schemas.openxmlformats.org/drawingml/2006/picture">
-                  <pic:nvPicPr>
-                    <pic:cNvPr id="0" name="" descr=""/>
-                    <pic:cNvPicPr>
-                      <a:picLocks noChangeAspect="1" noChangeArrowheads="1"/>
-                    </pic:cNvPicPr>
-                  </pic:nvPicPr>
-                  <pic:blipFill>
-                    <a:blip r:embed="rId17" cstate="none"/>
-                    <a:srcRect/>
-                    <a:stretch>
-                      <a:fillRect/>
-                    </a:stretch>
-                  </pic:blipFill>
-                  <pic:spPr bwMode="auto">
-                    <a:xfrm>
-                      <a:off x="0" y="0"/>
                       <a:ext cx="5715000" cy="2314575"/>
                     </a:xfrm>
                     <a:prstGeom prst="rect">

</xml_diff>

<commit_message>
docs: CI/CD setup doc — success-only steps, no error screenshots
Removed the ssh-keygen PowerShell quoting error and the redundant
GitHub Actions landing-page navigation screenshot. Doc now shows a
clean Step 1-5 success sequence only.

Co-Authored-By: Claude Sonnet 5 <noreply@anthropic.com>
</commit_message>
<xml_diff>
--- a/ci-cd-setup/CI-CD-Setup-dm-dashboard.docx
+++ b/ci-cd-setup/CI-CD-Setup-dm-dashboard.docx
@@ -96,14 +96,14 @@
         <w:pStyle w:val="Heading2"/>
       </w:pPr>
       <w:r>
-        <w:t xml:space="preserve">Step 1a — ssh-keygen quoting issue in PowerShell</w:t>
+        <w:t xml:space="preserve">Step 1 — Public key added to the VPS</w:t>
       </w:r>
     </w:p>
     <w:p>
       <w:r>
         <w:drawing>
           <wp:inline distT="0" distB="0" distL="0" distR="0">
-            <wp:extent cx="5715000" cy="4181475"/>
+            <wp:extent cx="5715000" cy="1000125"/>
             <wp:effectExtent t="0" r="0" b="0" l="0"/>
             <wp:docPr id="1" name="" descr="" title=""/>
             <wp:cNvGraphicFramePr>
@@ -128,7 +128,7 @@
                   <pic:spPr bwMode="auto">
                     <a:xfrm>
                       <a:off x="0" y="0"/>
-                      <a:ext cx="5715000" cy="4181475"/>
+                      <a:ext cx="5715000" cy="1000125"/>
                     </a:xfrm>
                     <a:prstGeom prst="rect">
                       <a:avLst/>
@@ -150,7 +150,7 @@
           <w:sz w:val="20"/>
           <w:szCs w:val="20"/>
         </w:rPr>
-        <w:t xml:space="preserve">PowerShell swallowed the empty-passphrase argument ("-N \"\"") and ssh-keygen errored out. Fixed by dropping -N entirely and pressing Enter twice at the interactive passphrase prompts instead.</w:t>
+        <w:t xml:space="preserve">Connected to the Contabo VPS and appended the new public key to ~/.ssh/authorized_keys, then confirmed with cat — the new "github-actions-deploy" key is listed.</w:t>
       </w:r>
     </w:p>
     <w:p/>
@@ -159,14 +159,14 @@
         <w:pStyle w:val="Heading2"/>
       </w:pPr>
       <w:r>
-        <w:t xml:space="preserve">Step 2 — Public key added to the VPS</w:t>
+        <w:t xml:space="preserve">Step 2 — Repository secrets page</w:t>
       </w:r>
     </w:p>
     <w:p>
       <w:r>
         <w:drawing>
           <wp:inline distT="0" distB="0" distL="0" distR="0">
-            <wp:extent cx="5715000" cy="1000125"/>
+            <wp:extent cx="5715000" cy="3038475"/>
             <wp:effectExtent t="0" r="0" b="0" l="0"/>
             <wp:docPr id="1" name="" descr="" title=""/>
             <wp:cNvGraphicFramePr>
@@ -191,7 +191,7 @@
                   <pic:spPr bwMode="auto">
                     <a:xfrm>
                       <a:off x="0" y="0"/>
-                      <a:ext cx="5715000" cy="1000125"/>
+                      <a:ext cx="5715000" cy="3038475"/>
                     </a:xfrm>
                     <a:prstGeom prst="rect">
                       <a:avLst/>
@@ -213,7 +213,7 @@
           <w:sz w:val="20"/>
           <w:szCs w:val="20"/>
         </w:rPr>
-        <w:t xml:space="preserve">Connected to the Contabo VPS and appended the new public key to ~/.ssh/authorized_keys, then confirmed with cat — the new "github-actions-deploy" key is listed.</w:t>
+        <w:t xml:space="preserve">Settings &gt; Secrets and variables &gt; Actions, where the 4 deploy secrets were added.</w:t>
       </w:r>
     </w:p>
     <w:p/>
@@ -222,14 +222,14 @@
         <w:pStyle w:val="Heading2"/>
       </w:pPr>
       <w:r>
-        <w:t xml:space="preserve">Step 3 (navigation) — GitHub Actions "get started" page</w:t>
+        <w:t xml:space="preserve">Step 2 — All 4 secrets added</w:t>
       </w:r>
     </w:p>
     <w:p>
       <w:r>
         <w:drawing>
           <wp:inline distT="0" distB="0" distL="0" distR="0">
-            <wp:extent cx="5715000" cy="3009900"/>
+            <wp:extent cx="5715000" cy="2981325"/>
             <wp:effectExtent t="0" r="0" b="0" l="0"/>
             <wp:docPr id="1" name="" descr="" title=""/>
             <wp:cNvGraphicFramePr>
@@ -254,7 +254,7 @@
                   <pic:spPr bwMode="auto">
                     <a:xfrm>
                       <a:off x="0" y="0"/>
-                      <a:ext cx="5715000" cy="3009900"/>
+                      <a:ext cx="5715000" cy="2981325"/>
                     </a:xfrm>
                     <a:prstGeom prst="rect">
                       <a:avLst/>
@@ -276,7 +276,7 @@
           <w:sz w:val="20"/>
           <w:szCs w:val="20"/>
         </w:rPr>
-        <w:t xml:space="preserve">The default Actions landing page reached before going to Settings first for the secrets.</w:t>
+        <w:t xml:space="preserve">VPS_HOST, VPS_SSH_KEY, VPS_SSH_PORT, and VPS_USER all confirmed present in the repository secrets list.</w:t>
       </w:r>
     </w:p>
     <w:p/>
@@ -285,14 +285,14 @@
         <w:pStyle w:val="Heading2"/>
       </w:pPr>
       <w:r>
-        <w:t xml:space="preserve">Step 3 — Repository secrets page (before)</w:t>
+        <w:t xml:space="preserve">Step 3 — Workflow YAML in the GitHub editor</w:t>
       </w:r>
     </w:p>
     <w:p>
       <w:r>
         <w:drawing>
           <wp:inline distT="0" distB="0" distL="0" distR="0">
-            <wp:extent cx="5715000" cy="3038475"/>
+            <wp:extent cx="5715000" cy="2981325"/>
             <wp:effectExtent t="0" r="0" b="0" l="0"/>
             <wp:docPr id="1" name="" descr="" title=""/>
             <wp:cNvGraphicFramePr>
@@ -317,7 +317,7 @@
                   <pic:spPr bwMode="auto">
                     <a:xfrm>
                       <a:off x="0" y="0"/>
-                      <a:ext cx="5715000" cy="3038475"/>
+                      <a:ext cx="5715000" cy="2981325"/>
                     </a:xfrm>
                     <a:prstGeom prst="rect">
                       <a:avLst/>
@@ -339,7 +339,7 @@
           <w:sz w:val="20"/>
           <w:szCs w:val="20"/>
         </w:rPr>
-        <w:t xml:space="preserve">Settings &gt; Secrets and variables &gt; Actions, before any of the 4 deploy secrets were added.</w:t>
+        <w:t xml:space="preserve">deploy.yml created directly in GitHub's web editor under .github/workflows/, triggered on push to main, running the existing deploy.sh over SSH via the appleboy/ssh-action.</w:t>
       </w:r>
     </w:p>
     <w:p/>
@@ -348,7 +348,7 @@
         <w:pStyle w:val="Heading2"/>
       </w:pPr>
       <w:r>
-        <w:t xml:space="preserve">Step 3 — All 4 secrets added</w:t>
+        <w:t xml:space="preserve">Step 3 — Committing the workflow file</w:t>
       </w:r>
     </w:p>
     <w:p>
@@ -402,7 +402,7 @@
           <w:sz w:val="20"/>
           <w:szCs w:val="20"/>
         </w:rPr>
-        <w:t xml:space="preserve">VPS_HOST, VPS_SSH_KEY, VPS_SSH_PORT, and VPS_USER all confirmed present in the repository secrets list.</w:t>
+        <w:t xml:space="preserve">Commit dialog, committing deploy.yml directly to the main branch.</w:t>
       </w:r>
     </w:p>
     <w:p/>
@@ -411,14 +411,14 @@
         <w:pStyle w:val="Heading2"/>
       </w:pPr>
       <w:r>
-        <w:t xml:space="preserve">Step 4 — Workflow YAML in the GitHub editor</w:t>
+        <w:t xml:space="preserve">Step 3 — deploy.yml committed</w:t>
       </w:r>
     </w:p>
     <w:p>
       <w:r>
         <w:drawing>
           <wp:inline distT="0" distB="0" distL="0" distR="0">
-            <wp:extent cx="5715000" cy="2981325"/>
+            <wp:extent cx="5715000" cy="2857500"/>
             <wp:effectExtent t="0" r="0" b="0" l="0"/>
             <wp:docPr id="1" name="" descr="" title=""/>
             <wp:cNvGraphicFramePr>
@@ -443,7 +443,7 @@
                   <pic:spPr bwMode="auto">
                     <a:xfrm>
                       <a:off x="0" y="0"/>
-                      <a:ext cx="5715000" cy="2981325"/>
+                      <a:ext cx="5715000" cy="2857500"/>
                     </a:xfrm>
                     <a:prstGeom prst="rect">
                       <a:avLst/>
@@ -465,7 +465,7 @@
           <w:sz w:val="20"/>
           <w:szCs w:val="20"/>
         </w:rPr>
-        <w:t xml:space="preserve">deploy.yml created directly in GitHub's web editor under .github/workflows/, triggered on push to main, running the existing deploy.sh over SSH via the appleboy/ssh-action.</w:t>
+        <w:t xml:space="preserve">The file now exists in .github/workflows/ on main.</w:t>
       </w:r>
     </w:p>
     <w:p/>
@@ -474,14 +474,14 @@
         <w:pStyle w:val="Heading2"/>
       </w:pPr>
       <w:r>
-        <w:t xml:space="preserve">Step 4 — Committing the workflow file</w:t>
+        <w:t xml:space="preserve">Step 4 — First automatic deploy run: SUCCESS</w:t>
       </w:r>
     </w:p>
     <w:p>
       <w:r>
         <w:drawing>
           <wp:inline distT="0" distB="0" distL="0" distR="0">
-            <wp:extent cx="5715000" cy="2981325"/>
+            <wp:extent cx="5715000" cy="3009900"/>
             <wp:effectExtent t="0" r="0" b="0" l="0"/>
             <wp:docPr id="1" name="" descr="" title=""/>
             <wp:cNvGraphicFramePr>
@@ -506,7 +506,7 @@
                   <pic:spPr bwMode="auto">
                     <a:xfrm>
                       <a:off x="0" y="0"/>
-                      <a:ext cx="5715000" cy="2981325"/>
+                      <a:ext cx="5715000" cy="3009900"/>
                     </a:xfrm>
                     <a:prstGeom prst="rect">
                       <a:avLst/>
@@ -528,7 +528,7 @@
           <w:sz w:val="20"/>
           <w:szCs w:val="20"/>
         </w:rPr>
-        <w:t xml:space="preserve">Commit dialog, committing deploy.yml directly to the main branch.</w:t>
+        <w:t xml:space="preserve">The commit that added the workflow was itself a push to main, so it immediately triggered the very first automated run — green check, completed in 19 seconds. CI/CD is live: every future merge to main now deploys automatically.</w:t>
       </w:r>
     </w:p>
     <w:p/>
@@ -537,14 +537,14 @@
         <w:pStyle w:val="Heading2"/>
       </w:pPr>
       <w:r>
-        <w:t xml:space="preserve">Step 4 — deploy.yml committed</w:t>
+        <w:t xml:space="preserve">Step 5 — Confirmed on the VPS itself</w:t>
       </w:r>
     </w:p>
     <w:p>
       <w:r>
         <w:drawing>
           <wp:inline distT="0" distB="0" distL="0" distR="0">
-            <wp:extent cx="5715000" cy="2857500"/>
+            <wp:extent cx="5715000" cy="2314575"/>
             <wp:effectExtent t="0" r="0" b="0" l="0"/>
             <wp:docPr id="1" name="" descr="" title=""/>
             <wp:cNvGraphicFramePr>
@@ -569,132 +569,6 @@
                   <pic:spPr bwMode="auto">
                     <a:xfrm>
                       <a:off x="0" y="0"/>
-                      <a:ext cx="5715000" cy="2857500"/>
-                    </a:xfrm>
-                    <a:prstGeom prst="rect">
-                      <a:avLst/>
-                    </a:prstGeom>
-                  </pic:spPr>
-                </pic:pic>
-              </a:graphicData>
-            </a:graphic>
-          </wp:inline>
-        </w:drawing>
-      </w:r>
-    </w:p>
-    <w:p>
-      <w:r>
-        <w:rPr>
-          <w:i/>
-          <w:iCs/>
-          <w:color w:val="555555"/>
-          <w:sz w:val="20"/>
-          <w:szCs w:val="20"/>
-        </w:rPr>
-        <w:t xml:space="preserve">The file now exists in .github/workflows/ on main.</w:t>
-      </w:r>
-    </w:p>
-    <w:p/>
-    <w:p>
-      <w:pPr>
-        <w:pStyle w:val="Heading2"/>
-      </w:pPr>
-      <w:r>
-        <w:t xml:space="preserve">Step 5 — First automatic deploy run: SUCCESS</w:t>
-      </w:r>
-    </w:p>
-    <w:p>
-      <w:r>
-        <w:drawing>
-          <wp:inline distT="0" distB="0" distL="0" distR="0">
-            <wp:extent cx="5715000" cy="3009900"/>
-            <wp:effectExtent t="0" r="0" b="0" l="0"/>
-            <wp:docPr id="1" name="" descr="" title=""/>
-            <wp:cNvGraphicFramePr>
-              <a:graphicFrameLocks xmlns:a="http://schemas.openxmlformats.org/drawingml/2006/main" noChangeAspect="1"/>
-            </wp:cNvGraphicFramePr>
-            <a:graphic xmlns:a="http://schemas.openxmlformats.org/drawingml/2006/main">
-              <a:graphicData uri="http://schemas.openxmlformats.org/drawingml/2006/picture">
-                <pic:pic xmlns:pic="http://schemas.openxmlformats.org/drawingml/2006/picture">
-                  <pic:nvPicPr>
-                    <pic:cNvPr id="0" name="" descr=""/>
-                    <pic:cNvPicPr>
-                      <a:picLocks noChangeAspect="1" noChangeArrowheads="1"/>
-                    </pic:cNvPicPr>
-                  </pic:nvPicPr>
-                  <pic:blipFill>
-                    <a:blip r:embed="rId15" cstate="none"/>
-                    <a:srcRect/>
-                    <a:stretch>
-                      <a:fillRect/>
-                    </a:stretch>
-                  </pic:blipFill>
-                  <pic:spPr bwMode="auto">
-                    <a:xfrm>
-                      <a:off x="0" y="0"/>
-                      <a:ext cx="5715000" cy="3009900"/>
-                    </a:xfrm>
-                    <a:prstGeom prst="rect">
-                      <a:avLst/>
-                    </a:prstGeom>
-                  </pic:spPr>
-                </pic:pic>
-              </a:graphicData>
-            </a:graphic>
-          </wp:inline>
-        </w:drawing>
-      </w:r>
-    </w:p>
-    <w:p>
-      <w:r>
-        <w:rPr>
-          <w:i/>
-          <w:iCs/>
-          <w:color w:val="555555"/>
-          <w:sz w:val="20"/>
-          <w:szCs w:val="20"/>
-        </w:rPr>
-        <w:t xml:space="preserve">The commit that added the workflow was itself a push to main, so it immediately triggered the very first automated run — green check, completed in 19 seconds. CI/CD is live: every future merge to main now deploys automatically.</w:t>
-      </w:r>
-    </w:p>
-    <w:p/>
-    <w:p>
-      <w:pPr>
-        <w:pStyle w:val="Heading2"/>
-      </w:pPr>
-      <w:r>
-        <w:t xml:space="preserve">Step 5 (verification) — Confirmed on the VPS itself</w:t>
-      </w:r>
-    </w:p>
-    <w:p>
-      <w:r>
-        <w:drawing>
-          <wp:inline distT="0" distB="0" distL="0" distR="0">
-            <wp:extent cx="5715000" cy="2314575"/>
-            <wp:effectExtent t="0" r="0" b="0" l="0"/>
-            <wp:docPr id="1" name="" descr="" title=""/>
-            <wp:cNvGraphicFramePr>
-              <a:graphicFrameLocks xmlns:a="http://schemas.openxmlformats.org/drawingml/2006/main" noChangeAspect="1"/>
-            </wp:cNvGraphicFramePr>
-            <a:graphic xmlns:a="http://schemas.openxmlformats.org/drawingml/2006/main">
-              <a:graphicData uri="http://schemas.openxmlformats.org/drawingml/2006/picture">
-                <pic:pic xmlns:pic="http://schemas.openxmlformats.org/drawingml/2006/picture">
-                  <pic:nvPicPr>
-                    <pic:cNvPr id="0" name="" descr=""/>
-                    <pic:cNvPicPr>
-                      <a:picLocks noChangeAspect="1" noChangeArrowheads="1"/>
-                    </pic:cNvPicPr>
-                  </pic:nvPicPr>
-                  <pic:blipFill>
-                    <a:blip r:embed="rId16" cstate="none"/>
-                    <a:srcRect/>
-                    <a:stretch>
-                      <a:fillRect/>
-                    </a:stretch>
-                  </pic:blipFill>
-                  <pic:spPr bwMode="auto">
-                    <a:xfrm>
-                      <a:off x="0" y="0"/>
                       <a:ext cx="5715000" cy="2314575"/>
                     </a:xfrm>
                     <a:prstGeom prst="rect">
@@ -717,7 +591,7 @@
           <w:sz w:val="20"/>
           <w:szCs w:val="20"/>
         </w:rPr>
-        <w:t xml:space="preserve">journalctl -u dm-dashboard -n 20 --no-pager on the server shows the real sequence: old process stopped (08:52:57), service restarted, new process started and serving live traffic seconds later. This confirms the automated run genuinely redeployed the backend, not just a green checkmark in GitHub's UI.</w:t>
+        <w:t xml:space="preserve">journalctl -u dm-dashboard -n 20 --no-pager on the server shows the real sequence: old process stopped, service restarted, new process started and serving live traffic seconds later. This confirms the automated run genuinely redeployed the backend, not just a green checkmark in GitHub's UI.</w:t>
       </w:r>
     </w:p>
     <w:p/>

</xml_diff>